<commit_message>
Student uploads NID, resume and other documents as one PDF
The registration upload was described only as an identity document and
accepted images and Word files. It is now one PDF that holds the
citizenship / NID, the resume and any other certificates, so a company
reviewing an applicant can read the resume it never had before.

- routes/auth.py: only PDF is accepted; clearer message on refusal
- register_student.html: new label and help text explaining the one file
- applicants.html / verifications.html: link renamed to match
- new test TC-27: a non-PDF upload is refused (36 tests, all passing)
- report FR-16, schema table, scope, limitations and future work updated
- figures 4 and 16 and the viva sheet regenerated
- defense deck updated (test count, demo step, limitation, future work)

Co-Authored-By: Claude Opus 5 <noreply@anthropic.com>
Claude-Session: https://claude.ai/code/session_013xPLnyFTSjbxMiATP4c7ND
</commit_message>
<xml_diff>
--- a/docs/Viva_QA_Sheet.docx
+++ b/docs/Viva_QA_Sheet.docx
@@ -343,7 +343,7 @@
               <w:t xml:space="preserve">“</w:t>
             </w:r>
             <w:r>
-              <w:t xml:space="preserve">Notice the college dropdown and the compulsory document upload.</w:t>
+              <w:t xml:space="preserve">Notice the college dropdown and the compulsory PDF upload — citizenship / NID, resume and other documents in one file.</w:t>
             </w:r>
             <w:r>
               <w:t xml:space="preserve">”</w:t>
@@ -534,7 +534,7 @@
               <w:t xml:space="preserve">“</w:t>
             </w:r>
             <w:r>
-              <w:t xml:space="preserve">The company sees the student’s college, skills, cover letter and document.</w:t>
+              <w:t xml:space="preserve">The company sees the student’s college, skills, cover letter and the uploaded PDF with the NID and resume.</w:t>
             </w:r>
             <w:r>
               <w:t xml:space="preserve">”</w:t>
@@ -1253,13 +1253,25 @@
         <w:t xml:space="preserve"> </w:t>
       </w:r>
       <w:r>
-        <w:t xml:space="preserve">supervisor feedback and marks, notifications, audit log, analytics</w:t>
-      </w:r>
-      <w:r>
-        <w:t xml:space="preserve"> </w:t>
-      </w:r>
-      <w:r>
-        <w:t xml:space="preserve">dashboards, CSV exports, a REST API, and college and user administration.</w:t>
+        <w:t xml:space="preserve">supervisor feedback and marks, notifications, audit log, CSV exports,</w:t>
+      </w:r>
+      <w:r>
+        <w:t xml:space="preserve"> </w:t>
+      </w:r>
+      <w:r>
+        <w:t xml:space="preserve">and college and user administration. Each student uploads one PDF holding</w:t>
+      </w:r>
+      <w:r>
+        <w:t xml:space="preserve"> </w:t>
+      </w:r>
+      <w:r>
+        <w:t xml:space="preserve">the citizenship / NID, resume and other documents, which the admin checks</w:t>
+      </w:r>
+      <w:r>
+        <w:t xml:space="preserve"> </w:t>
+      </w:r>
+      <w:r>
+        <w:t xml:space="preserve">before approving and the company reads when the student applies.</w:t>
       </w:r>
       <w:r>
         <w:t xml:space="preserve"> </w:t>
@@ -1271,7 +1283,13 @@
         <w:t xml:space="preserve"> </w:t>
       </w:r>
       <w:r>
-        <w:t xml:space="preserve">between users, and resume uploads — these are listed as future scope.</w:t>
+        <w:t xml:space="preserve">between users, and separate file attachments on the weekly logs — these are</w:t>
+      </w:r>
+      <w:r>
+        <w:t xml:space="preserve"> </w:t>
+      </w:r>
+      <w:r>
+        <w:t xml:space="preserve">listed as future scope.</w:t>
       </w:r>
     </w:p>
     <w:bookmarkEnd w:id="24"/>
@@ -4272,13 +4290,19 @@
           <w:bCs/>
           <w:b/>
         </w:rPr>
-        <w:t xml:space="preserve">Resume upload</w:t>
-      </w:r>
-      <w:r>
-        <w:t xml:space="preserve"> </w:t>
-      </w:r>
-      <w:r>
-        <w:t xml:space="preserve">— only the identity document is uploaded at registration.</w:t>
+        <w:t xml:space="preserve">Separate file fields</w:t>
+      </w:r>
+      <w:r>
+        <w:t xml:space="preserve"> </w:t>
+      </w:r>
+      <w:r>
+        <w:t xml:space="preserve">— the NID, resume and other papers arrive as one</w:t>
+      </w:r>
+      <w:r>
+        <w:t xml:space="preserve"> </w:t>
+      </w:r>
+      <w:r>
+        <w:t xml:space="preserve">combined PDF, not as separate uploads that the system can read individually.</w:t>
       </w:r>
     </w:p>
     <w:p>
@@ -4580,7 +4604,7 @@
               <w:jc w:val="left"/>
             </w:pPr>
             <w:r>
-              <w:t xml:space="preserve">35, all passing</w:t>
+              <w:t xml:space="preserve">36, all passing</w:t>
             </w:r>
           </w:p>
         </w:tc>
@@ -4606,7 +4630,7 @@
               <w:jc w:val="left"/>
             </w:pPr>
             <w:r>
-              <w:t xml:space="preserve">26</w:t>
+              <w:t xml:space="preserve">27</w:t>
             </w:r>
           </w:p>
         </w:tc>

</xml_diff>

<commit_message>
Bring the documents back in line with the ninth table
- Report: nine tables throughout, FR-24 for notifications, TC-22..TC-24
  and the badge-clearing check added, schema Table 4.11 and the
  relationships row restored, the notifications page described in the
  interface section, and the annex figures renumbered around the new
  screenshot. 118 A4 pages.
- Diagrams: ER, DFD level 1, use case and the architecture diagram
  regenerated with notifications.
- Deck: table and test counts, the Notifications feature card, and the
  demo script wording.
- Viva sheet: quick-facts card, ER answer, a new question on how a user
  finds out something happened, and the honest-limitations list back to
  "email and SMS not implemented".
- README: nine tables and the notifications feature.

33 tests pass.

Co-Authored-By: Claude Opus 5 <noreply@anthropic.com>
Claude-Session: https://claude.ai/code/session_013xPLnyFTSjbxMiATP4c7ND
</commit_message>
<xml_diff>
--- a/docs/Viva_QA_Sheet.docx
+++ b/docs/Viva_QA_Sheet.docx
@@ -133,7 +133,7 @@
         <w:t xml:space="preserve"> </w:t>
       </w:r>
       <w:r>
-        <w:t xml:space="preserve">Bootstrap interface. The database has eight tables, and we have written</w:t>
+        <w:t xml:space="preserve">Bootstrap interface. The database has nine tables, and we have written</w:t>
       </w:r>
       <w:r>
         <w:t xml:space="preserve"> </w:t>
@@ -632,7 +632,7 @@
               <w:t xml:space="preserve">“</w:t>
             </w:r>
             <w:r>
-              <w:t xml:space="preserve">My Applications now shows the status as selected, and the log book link has appeared.</w:t>
+              <w:t xml:space="preserve">The bell shows an unread count. The message links straight to the application.</w:t>
             </w:r>
             <w:r>
               <w:t xml:space="preserve">”</w:t>
@@ -1253,13 +1253,13 @@
         <w:t xml:space="preserve"> </w:t>
       </w:r>
       <w:r>
-        <w:t xml:space="preserve">supervisor feedback and marks, CSV exports and user administration.</w:t>
-      </w:r>
-      <w:r>
-        <w:t xml:space="preserve"> </w:t>
-      </w:r>
-      <w:r>
-        <w:t xml:space="preserve">Each student uploads one PDF holding</w:t>
+        <w:t xml:space="preserve">supervisor feedback and marks, in-app notifications, CSV exports and user</w:t>
+      </w:r>
+      <w:r>
+        <w:t xml:space="preserve"> </w:t>
+      </w:r>
+      <w:r>
+        <w:t xml:space="preserve">administration. Each student uploads one PDF holding</w:t>
       </w:r>
       <w:r>
         <w:t xml:space="preserve"> </w:t>
@@ -1317,7 +1317,7 @@
         <w:t xml:space="preserve"> </w:t>
       </w:r>
       <w:r>
-        <w:t xml:space="preserve">Eight:</w:t>
+        <w:t xml:space="preserve">Nine:</w:t>
       </w:r>
       <w:r>
         <w:t xml:space="preserve"> </w:t>
@@ -1411,6 +1411,18 @@
           <w:rStyle w:val="VerbatimChar"/>
         </w:rPr>
         <w:t xml:space="preserve">progress_logs</w:t>
+      </w:r>
+      <w:r>
+        <w:t xml:space="preserve">,</w:t>
+      </w:r>
+      <w:r>
+        <w:t xml:space="preserve"> </w:t>
+      </w:r>
+      <w:r>
+        <w:rPr>
+          <w:rStyle w:val="VerbatimChar"/>
+        </w:rPr>
+        <w:t xml:space="preserve">notifications</w:t>
       </w:r>
       <w:r>
         <w:t xml:space="preserve">.</w:t>
@@ -2003,7 +2015,7 @@
         <w:t xml:space="preserve"> </w:t>
       </w:r>
       <w:r>
-        <w:t xml:space="preserve">defines the data model. The data tier is MySQL with eight tables.</w:t>
+        <w:t xml:space="preserve">defines the data model. The data tier is MySQL with nine tables.</w:t>
       </w:r>
     </w:p>
     <w:p>
@@ -3143,6 +3155,84 @@
           <w:bCs/>
           <w:b/>
         </w:rPr>
+        <w:t xml:space="preserve">Q: How does a user find out something happened?</w:t>
+      </w:r>
+      <w:r>
+        <w:t xml:space="preserve"> </w:t>
+      </w:r>
+      <w:r>
+        <w:t xml:space="preserve">Four events queue a notification: an application submitted, a decision</w:t>
+      </w:r>
+      <w:r>
+        <w:t xml:space="preserve"> </w:t>
+      </w:r>
+      <w:r>
+        <w:t xml:space="preserve">recorded, a weekly log submitted and feedback given. Approving or rejecting</w:t>
+      </w:r>
+      <w:r>
+        <w:t xml:space="preserve"> </w:t>
+      </w:r>
+      <w:r>
+        <w:t xml:space="preserve">an account notifies its owner too.</w:t>
+      </w:r>
+      <w:r>
+        <w:t xml:space="preserve"> </w:t>
+      </w:r>
+      <w:r>
+        <w:rPr>
+          <w:rStyle w:val="VerbatimChar"/>
+        </w:rPr>
+        <w:t xml:space="preserve">notify()</w:t>
+      </w:r>
+      <w:r>
+        <w:t xml:space="preserve"> </w:t>
+      </w:r>
+      <w:r>
+        <w:t xml:space="preserve">adds the row to the same</w:t>
+      </w:r>
+      <w:r>
+        <w:t xml:space="preserve"> </w:t>
+      </w:r>
+      <w:r>
+        <w:t xml:space="preserve">session as the action, so one</w:t>
+      </w:r>
+      <w:r>
+        <w:t xml:space="preserve"> </w:t>
+      </w:r>
+      <w:r>
+        <w:rPr>
+          <w:rStyle w:val="VerbatimChar"/>
+        </w:rPr>
+        <w:t xml:space="preserve">commit()</w:t>
+      </w:r>
+      <w:r>
+        <w:t xml:space="preserve"> </w:t>
+      </w:r>
+      <w:r>
+        <w:t xml:space="preserve">writes both — an application can</w:t>
+      </w:r>
+      <w:r>
+        <w:t xml:space="preserve"> </w:t>
+      </w:r>
+      <w:r>
+        <w:t xml:space="preserve">never exist without the company having been told. The bell in the navigation</w:t>
+      </w:r>
+      <w:r>
+        <w:t xml:space="preserve"> </w:t>
+      </w:r>
+      <w:r>
+        <w:t xml:space="preserve">bar shows the unread count, and opening the page marks them read.</w:t>
+      </w:r>
+    </w:p>
+    <w:p>
+      <w:pPr>
+        <w:pStyle w:val="BodyText"/>
+      </w:pPr>
+      <w:r>
+        <w:rPr>
+          <w:bCs/>
+          <w:b/>
+        </w:rPr>
         <w:t xml:space="preserve">Q: How do you know who created a record?</w:t>
       </w:r>
       <w:r>
@@ -3584,7 +3674,7 @@
         <w:t xml:space="preserve"> </w:t>
       </w:r>
       <w:r>
-        <w:t xml:space="preserve">Eight entities.</w:t>
+        <w:t xml:space="preserve">Nine entities.</w:t>
       </w:r>
       <w:r>
         <w:t xml:space="preserve"> </w:t>
@@ -3695,7 +3785,7 @@
         <w:t xml:space="preserve"> </w:t>
       </w:r>
       <w:r>
-        <w:t xml:space="preserve">from students; and each application contains</w:t>
+        <w:t xml:space="preserve">from students; each application contains</w:t>
       </w:r>
       <w:r>
         <w:t xml:space="preserve"> </w:t>
@@ -3713,7 +3803,25 @@
         <w:t xml:space="preserve"> </w:t>
       </w:r>
       <w:r>
-        <w:t xml:space="preserve">which a supervisor evaluates with feedback and marks.</w:t>
+        <w:t xml:space="preserve">which a supervisor evaluates with feedback and marks; and every user can</w:t>
+      </w:r>
+      <w:r>
+        <w:t xml:space="preserve"> </w:t>
+      </w:r>
+      <w:r>
+        <w:t xml:space="preserve">receive</w:t>
+      </w:r>
+      <w:r>
+        <w:t xml:space="preserve"> </w:t>
+      </w:r>
+      <w:r>
+        <w:rPr>
+          <w:rStyle w:val="VerbatimChar"/>
+        </w:rPr>
+        <w:t xml:space="preserve">notifications</w:t>
+      </w:r>
+      <w:r>
+        <w:t xml:space="preserve">.</w:t>
       </w:r>
     </w:p>
     <w:p>
@@ -4031,7 +4139,7 @@
         <w:t xml:space="preserve"> </w:t>
       </w:r>
       <w:r>
-        <w:t xml:space="preserve">In-application notifications and then email delivery of them, interview</w:t>
+        <w:t xml:space="preserve">Email delivery of the notifications we already generate, interview</w:t>
       </w:r>
       <w:r>
         <w:t xml:space="preserve"> </w:t>
@@ -4091,25 +4199,25 @@
           <w:bCs/>
           <w:b/>
         </w:rPr>
-        <w:t xml:space="preserve">Notifications of any kind</w:t>
-      </w:r>
-      <w:r>
-        <w:t xml:space="preserve"> </w:t>
-      </w:r>
-      <w:r>
-        <w:t xml:space="preserve">— not implemented. A student sees a decision</w:t>
-      </w:r>
-      <w:r>
-        <w:t xml:space="preserve"> </w:t>
-      </w:r>
-      <w:r>
-        <w:t xml:space="preserve">by opening My Applications, not by being told. This was a deliberate</w:t>
-      </w:r>
-      <w:r>
-        <w:t xml:space="preserve"> </w:t>
-      </w:r>
-      <w:r>
-        <w:t xml:space="preserve">simplification so the schema stays at eight tables.</w:t>
+        <w:t xml:space="preserve">Email and SMS</w:t>
+      </w:r>
+      <w:r>
+        <w:t xml:space="preserve"> </w:t>
+      </w:r>
+      <w:r>
+        <w:t xml:space="preserve">— not implemented. Notifications are inside the</w:t>
+      </w:r>
+      <w:r>
+        <w:t xml:space="preserve"> </w:t>
+      </w:r>
+      <w:r>
+        <w:t xml:space="preserve">application only, because we had no mail server to demonstrate with. The</w:t>
+      </w:r>
+      <w:r>
+        <w:t xml:space="preserve"> </w:t>
+      </w:r>
+      <w:r>
+        <w:t xml:space="preserve">events are already stored, so only the delivery channel is missing.</w:t>
       </w:r>
     </w:p>
     <w:p>
@@ -4381,7 +4489,7 @@
               <w:jc w:val="left"/>
             </w:pPr>
             <w:r>
-              <w:t xml:space="preserve">8</w:t>
+              <w:t xml:space="preserve">9</w:t>
             </w:r>
           </w:p>
         </w:tc>
@@ -4407,7 +4515,7 @@
               <w:jc w:val="left"/>
             </w:pPr>
             <w:r>
-              <w:t xml:space="preserve">8 (</w:t>
+              <w:t xml:space="preserve">9 (</w:t>
             </w:r>
             <w:r>
               <w:rPr>
@@ -4442,7 +4550,7 @@
               <w:jc w:val="left"/>
             </w:pPr>
             <w:r>
-              <w:t xml:space="preserve">29 (</w:t>
+              <w:t xml:space="preserve">30 (</w:t>
             </w:r>
             <w:r>
               <w:rPr>
@@ -4512,7 +4620,7 @@
               <w:jc w:val="left"/>
             </w:pPr>
             <w:r>
-              <w:t xml:space="preserve">18 (all extend</w:t>
+              <w:t xml:space="preserve">19 (all extend</w:t>
             </w:r>
             <w:r>
               <w:t xml:space="preserve"> </w:t>
@@ -4550,7 +4658,7 @@
               <w:jc w:val="left"/>
             </w:pPr>
             <w:r>
-              <w:t xml:space="preserve">29, all passing</w:t>
+              <w:t xml:space="preserve">33, all passing</w:t>
             </w:r>
           </w:p>
         </w:tc>
@@ -4576,7 +4684,7 @@
               <w:jc w:val="left"/>
             </w:pPr>
             <w:r>
-              <w:t xml:space="preserve">21</w:t>
+              <w:t xml:space="preserve">24</w:t>
             </w:r>
           </w:p>
         </w:tc>
@@ -4602,7 +4710,7 @@
               <w:jc w:val="left"/>
             </w:pPr>
             <w:r>
-              <w:t xml:space="preserve">FR-1 … FR-23</w:t>
+              <w:t xml:space="preserve">FR-1 … FR-24</w:t>
             </w:r>
           </w:p>
         </w:tc>

</xml_diff>